<commit_message>
docs(ecc-ip/reed-solomon): D2 and D3 decided -- t and n are elaboration-time parameters
Sean, 2026-09-30: every code parameter is fixed at elaboration. T_SYMBOLS
(default 8) and N_SYMBOLS (default 2^m - 1, below that a shortened code) with
K derived; no run-time t or n, no cfg_t register. PRD rows D2/D3 record it,
the HAS parameter table drops their TBD marks and states the rule, and the
HAS PDF is rebuilt.
</commit_message>
<xml_diff>
--- a/projects/components/ecc-ip/reed-solomon/docs/Reed_Solomon_HAS_v0.1.docx
+++ b/projects/components/ecc-ip/reed-solomon/docs/Reed_Solomon_HAS_v0.1.docx
@@ -101,7 +101,7 @@
           <w:color w:val="000000"/>
           <w:sz w:val="20"/>
         </w:rPr>
-        <w:t>September 29, 2026</w:t>
+        <w:t>September 30, 2026</w:t>
       </w:r>
     </w:p>
     <w:p>
@@ -160,7 +160,7 @@
             </w:rPr>
             <w:fldChar w:fldCharType="separate"/>
           </w:r>
-          <w:hyperlink w:anchor="__RefHeading___Toc7869_1259212510">
+          <w:hyperlink w:anchor="__RefHeading___Toc7846_2866894291">
             <w:r>
               <w:rPr>
                 <w:webHidden/>
@@ -181,7 +181,7 @@
             </w:tabs>
             <w:rPr/>
           </w:pPr>
-          <w:hyperlink w:anchor="__RefHeading___Toc7871_1259212510">
+          <w:hyperlink w:anchor="__RefHeading___Toc7848_2866894291">
             <w:r>
               <w:rPr>
                 <w:webHidden/>
@@ -202,7 +202,7 @@
             </w:tabs>
             <w:rPr/>
           </w:pPr>
-          <w:hyperlink w:anchor="__RefHeading___Toc7873_1259212510">
+          <w:hyperlink w:anchor="__RefHeading___Toc7850_2866894291">
             <w:r>
               <w:rPr>
                 <w:webHidden/>
@@ -223,7 +223,7 @@
             </w:tabs>
             <w:rPr/>
           </w:pPr>
-          <w:hyperlink w:anchor="__RefHeading___Toc7875_1259212510">
+          <w:hyperlink w:anchor="__RefHeading___Toc7852_2866894291">
             <w:r>
               <w:rPr>
                 <w:webHidden/>
@@ -244,7 +244,7 @@
             </w:tabs>
             <w:rPr/>
           </w:pPr>
-          <w:hyperlink w:anchor="__RefHeading___Toc7877_1259212510">
+          <w:hyperlink w:anchor="__RefHeading___Toc7854_2866894291">
             <w:r>
               <w:rPr>
                 <w:webHidden/>
@@ -265,7 +265,7 @@
             </w:tabs>
             <w:rPr/>
           </w:pPr>
-          <w:hyperlink w:anchor="__RefHeading___Toc7879_1259212510">
+          <w:hyperlink w:anchor="__RefHeading___Toc7856_2866894291">
             <w:r>
               <w:rPr>
                 <w:webHidden/>
@@ -286,7 +286,7 @@
             </w:tabs>
             <w:rPr/>
           </w:pPr>
-          <w:hyperlink w:anchor="__RefHeading___Toc7881_1259212510">
+          <w:hyperlink w:anchor="__RefHeading___Toc7858_2866894291">
             <w:r>
               <w:rPr>
                 <w:webHidden/>
@@ -307,7 +307,7 @@
             </w:tabs>
             <w:rPr/>
           </w:pPr>
-          <w:hyperlink w:anchor="__RefHeading___Toc7883_1259212510">
+          <w:hyperlink w:anchor="__RefHeading___Toc7860_2866894291">
             <w:r>
               <w:rPr>
                 <w:webHidden/>
@@ -328,7 +328,7 @@
             </w:tabs>
             <w:rPr/>
           </w:pPr>
-          <w:hyperlink w:anchor="__RefHeading___Toc7885_1259212510">
+          <w:hyperlink w:anchor="__RefHeading___Toc7862_2866894291">
             <w:r>
               <w:rPr>
                 <w:webHidden/>
@@ -349,7 +349,7 @@
             </w:tabs>
             <w:rPr/>
           </w:pPr>
-          <w:hyperlink w:anchor="__RefHeading___Toc7887_1259212510">
+          <w:hyperlink w:anchor="__RefHeading___Toc7864_2866894291">
             <w:r>
               <w:rPr>
                 <w:webHidden/>
@@ -370,7 +370,7 @@
             </w:tabs>
             <w:rPr/>
           </w:pPr>
-          <w:hyperlink w:anchor="__RefHeading___Toc7889_1259212510">
+          <w:hyperlink w:anchor="__RefHeading___Toc7866_2866894291">
             <w:r>
               <w:rPr>
                 <w:webHidden/>
@@ -391,7 +391,7 @@
             </w:tabs>
             <w:rPr/>
           </w:pPr>
-          <w:hyperlink w:anchor="__RefHeading___Toc7891_1259212510">
+          <w:hyperlink w:anchor="__RefHeading___Toc7868_2866894291">
             <w:r>
               <w:rPr>
                 <w:webHidden/>
@@ -412,7 +412,7 @@
             </w:tabs>
             <w:rPr/>
           </w:pPr>
-          <w:hyperlink w:anchor="__RefHeading___Toc7893_1259212510">
+          <w:hyperlink w:anchor="__RefHeading___Toc7870_2866894291">
             <w:r>
               <w:rPr>
                 <w:webHidden/>
@@ -433,7 +433,7 @@
             </w:tabs>
             <w:rPr/>
           </w:pPr>
-          <w:hyperlink w:anchor="__RefHeading___Toc7895_1259212510">
+          <w:hyperlink w:anchor="__RefHeading___Toc7872_2866894291">
             <w:r>
               <w:rPr>
                 <w:webHidden/>
@@ -454,7 +454,7 @@
             </w:tabs>
             <w:rPr/>
           </w:pPr>
-          <w:hyperlink w:anchor="__RefHeading___Toc7897_1259212510">
+          <w:hyperlink w:anchor="__RefHeading___Toc7874_2866894291">
             <w:r>
               <w:rPr>
                 <w:webHidden/>
@@ -475,7 +475,7 @@
             </w:tabs>
             <w:rPr/>
           </w:pPr>
-          <w:hyperlink w:anchor="__RefHeading___Toc7899_1259212510">
+          <w:hyperlink w:anchor="__RefHeading___Toc7876_2866894291">
             <w:r>
               <w:rPr>
                 <w:webHidden/>
@@ -496,7 +496,7 @@
             </w:tabs>
             <w:rPr/>
           </w:pPr>
-          <w:hyperlink w:anchor="__RefHeading___Toc7901_1259212510">
+          <w:hyperlink w:anchor="__RefHeading___Toc7878_2866894291">
             <w:r>
               <w:rPr>
                 <w:webHidden/>
@@ -517,7 +517,7 @@
             </w:tabs>
             <w:rPr/>
           </w:pPr>
-          <w:hyperlink w:anchor="__RefHeading___Toc7903_1259212510">
+          <w:hyperlink w:anchor="__RefHeading___Toc7880_2866894291">
             <w:r>
               <w:rPr>
                 <w:webHidden/>
@@ -538,7 +538,7 @@
             </w:tabs>
             <w:rPr/>
           </w:pPr>
-          <w:hyperlink w:anchor="__RefHeading___Toc7905_1259212510">
+          <w:hyperlink w:anchor="__RefHeading___Toc7882_2866894291">
             <w:r>
               <w:rPr>
                 <w:webHidden/>
@@ -559,7 +559,7 @@
             </w:tabs>
             <w:rPr/>
           </w:pPr>
-          <w:hyperlink w:anchor="__RefHeading___Toc7907_1259212510">
+          <w:hyperlink w:anchor="__RefHeading___Toc7884_2866894291">
             <w:r>
               <w:rPr>
                 <w:webHidden/>
@@ -580,7 +580,7 @@
             </w:tabs>
             <w:rPr/>
           </w:pPr>
-          <w:hyperlink w:anchor="__RefHeading___Toc7909_1259212510">
+          <w:hyperlink w:anchor="__RefHeading___Toc7886_2866894291">
             <w:r>
               <w:rPr>
                 <w:webHidden/>
@@ -601,7 +601,7 @@
             </w:tabs>
             <w:rPr/>
           </w:pPr>
-          <w:hyperlink w:anchor="__RefHeading___Toc7911_1259212510">
+          <w:hyperlink w:anchor="__RefHeading___Toc7888_2866894291">
             <w:r>
               <w:rPr>
                 <w:webHidden/>
@@ -622,7 +622,7 @@
             </w:tabs>
             <w:rPr/>
           </w:pPr>
-          <w:hyperlink w:anchor="__RefHeading___Toc7913_1259212510">
+          <w:hyperlink w:anchor="__RefHeading___Toc7890_2866894291">
             <w:r>
               <w:rPr>
                 <w:webHidden/>
@@ -643,7 +643,7 @@
             </w:tabs>
             <w:rPr/>
           </w:pPr>
-          <w:hyperlink w:anchor="__RefHeading___Toc7915_1259212510">
+          <w:hyperlink w:anchor="__RefHeading___Toc7892_2866894291">
             <w:r>
               <w:rPr>
                 <w:webHidden/>
@@ -664,7 +664,7 @@
             </w:tabs>
             <w:rPr/>
           </w:pPr>
-          <w:hyperlink w:anchor="__RefHeading___Toc7917_1259212510">
+          <w:hyperlink w:anchor="__RefHeading___Toc7894_2866894291">
             <w:r>
               <w:rPr>
                 <w:webHidden/>
@@ -685,7 +685,7 @@
             </w:tabs>
             <w:rPr/>
           </w:pPr>
-          <w:hyperlink w:anchor="__RefHeading___Toc7919_1259212510">
+          <w:hyperlink w:anchor="__RefHeading___Toc7896_2866894291">
             <w:r>
               <w:rPr>
                 <w:webHidden/>
@@ -706,7 +706,7 @@
             </w:tabs>
             <w:rPr/>
           </w:pPr>
-          <w:hyperlink w:anchor="__RefHeading___Toc7921_1259212510">
+          <w:hyperlink w:anchor="__RefHeading___Toc7898_2866894291">
             <w:r>
               <w:rPr>
                 <w:webHidden/>
@@ -727,7 +727,7 @@
             </w:tabs>
             <w:rPr/>
           </w:pPr>
-          <w:hyperlink w:anchor="__RefHeading___Toc7923_1259212510">
+          <w:hyperlink w:anchor="__RefHeading___Toc7900_2866894291">
             <w:r>
               <w:rPr>
                 <w:webHidden/>
@@ -748,7 +748,7 @@
             </w:tabs>
             <w:rPr/>
           </w:pPr>
-          <w:hyperlink w:anchor="__RefHeading___Toc7925_1259212510">
+          <w:hyperlink w:anchor="__RefHeading___Toc7902_2866894291">
             <w:r>
               <w:rPr>
                 <w:webHidden/>
@@ -769,7 +769,7 @@
             </w:tabs>
             <w:rPr/>
           </w:pPr>
-          <w:hyperlink w:anchor="__RefHeading___Toc7927_1259212510">
+          <w:hyperlink w:anchor="__RefHeading___Toc7904_2866894291">
             <w:r>
               <w:rPr>
                 <w:webHidden/>
@@ -790,7 +790,7 @@
             </w:tabs>
             <w:rPr/>
           </w:pPr>
-          <w:hyperlink w:anchor="__RefHeading___Toc7929_1259212510">
+          <w:hyperlink w:anchor="__RefHeading___Toc7906_2866894291">
             <w:r>
               <w:rPr>
                 <w:webHidden/>
@@ -811,7 +811,7 @@
             </w:tabs>
             <w:rPr/>
           </w:pPr>
-          <w:hyperlink w:anchor="__RefHeading___Toc7931_1259212510">
+          <w:hyperlink w:anchor="__RefHeading___Toc7908_2866894291">
             <w:r>
               <w:rPr>
                 <w:webHidden/>
@@ -832,7 +832,7 @@
             </w:tabs>
             <w:rPr/>
           </w:pPr>
-          <w:hyperlink w:anchor="__RefHeading___Toc7933_1259212510">
+          <w:hyperlink w:anchor="__RefHeading___Toc7910_2866894291">
             <w:r>
               <w:rPr>
                 <w:webHidden/>
@@ -853,7 +853,7 @@
             </w:tabs>
             <w:rPr/>
           </w:pPr>
-          <w:hyperlink w:anchor="__RefHeading___Toc7935_1259212510">
+          <w:hyperlink w:anchor="__RefHeading___Toc7912_2866894291">
             <w:r>
               <w:rPr>
                 <w:webHidden/>
@@ -874,7 +874,7 @@
             </w:tabs>
             <w:rPr/>
           </w:pPr>
-          <w:hyperlink w:anchor="__RefHeading___Toc7937_1259212510">
+          <w:hyperlink w:anchor="__RefHeading___Toc7914_2866894291">
             <w:r>
               <w:rPr>
                 <w:webHidden/>
@@ -895,7 +895,7 @@
             </w:tabs>
             <w:rPr/>
           </w:pPr>
-          <w:hyperlink w:anchor="__RefHeading___Toc7939_1259212510">
+          <w:hyperlink w:anchor="__RefHeading___Toc7916_2866894291">
             <w:r>
               <w:rPr>
                 <w:webHidden/>
@@ -916,7 +916,7 @@
             </w:tabs>
             <w:rPr/>
           </w:pPr>
-          <w:hyperlink w:anchor="__RefHeading___Toc7941_1259212510">
+          <w:hyperlink w:anchor="__RefHeading___Toc7918_2866894291">
             <w:r>
               <w:rPr>
                 <w:webHidden/>
@@ -937,7 +937,7 @@
             </w:tabs>
             <w:rPr/>
           </w:pPr>
-          <w:hyperlink w:anchor="__RefHeading___Toc7943_1259212510">
+          <w:hyperlink w:anchor="__RefHeading___Toc7920_2866894291">
             <w:r>
               <w:rPr>
                 <w:webHidden/>
@@ -958,7 +958,7 @@
             </w:tabs>
             <w:rPr/>
           </w:pPr>
-          <w:hyperlink w:anchor="__RefHeading___Toc7945_1259212510">
+          <w:hyperlink w:anchor="__RefHeading___Toc7922_2866894291">
             <w:r>
               <w:rPr>
                 <w:webHidden/>
@@ -979,7 +979,7 @@
             </w:tabs>
             <w:rPr/>
           </w:pPr>
-          <w:hyperlink w:anchor="__RefHeading___Toc7947_1259212510">
+          <w:hyperlink w:anchor="__RefHeading___Toc7924_2866894291">
             <w:r>
               <w:rPr>
                 <w:webHidden/>
@@ -1000,7 +1000,7 @@
             </w:tabs>
             <w:rPr/>
           </w:pPr>
-          <w:hyperlink w:anchor="__RefHeading___Toc7949_1259212510">
+          <w:hyperlink w:anchor="__RefHeading___Toc7926_2866894291">
             <w:r>
               <w:rPr>
                 <w:webHidden/>
@@ -1021,7 +1021,7 @@
             </w:tabs>
             <w:rPr/>
           </w:pPr>
-          <w:hyperlink w:anchor="__RefHeading___Toc7951_1259212510">
+          <w:hyperlink w:anchor="__RefHeading___Toc7928_2866894291">
             <w:r>
               <w:rPr>
                 <w:webHidden/>
@@ -1042,7 +1042,7 @@
             </w:tabs>
             <w:rPr/>
           </w:pPr>
-          <w:hyperlink w:anchor="__RefHeading___Toc7953_1259212510">
+          <w:hyperlink w:anchor="__RefHeading___Toc7930_2866894291">
             <w:r>
               <w:rPr>
                 <w:webHidden/>
@@ -1063,7 +1063,7 @@
             </w:tabs>
             <w:rPr/>
           </w:pPr>
-          <w:hyperlink w:anchor="__RefHeading___Toc7955_1259212510">
+          <w:hyperlink w:anchor="__RefHeading___Toc7932_2866894291">
             <w:r>
               <w:rPr>
                 <w:webHidden/>
@@ -1084,7 +1084,7 @@
             </w:tabs>
             <w:rPr/>
           </w:pPr>
-          <w:hyperlink w:anchor="__RefHeading___Toc7957_1259212510">
+          <w:hyperlink w:anchor="__RefHeading___Toc7934_2866894291">
             <w:r>
               <w:rPr>
                 <w:webHidden/>
@@ -1105,7 +1105,7 @@
             </w:tabs>
             <w:rPr/>
           </w:pPr>
-          <w:hyperlink w:anchor="__RefHeading___Toc7959_1259212510">
+          <w:hyperlink w:anchor="__RefHeading___Toc7936_2866894291">
             <w:r>
               <w:rPr>
                 <w:webHidden/>
@@ -1126,7 +1126,7 @@
             </w:tabs>
             <w:rPr/>
           </w:pPr>
-          <w:hyperlink w:anchor="__RefHeading___Toc7961_1259212510">
+          <w:hyperlink w:anchor="__RefHeading___Toc7938_2866894291">
             <w:r>
               <w:rPr>
                 <w:webHidden/>
@@ -1147,7 +1147,7 @@
             </w:tabs>
             <w:rPr/>
           </w:pPr>
-          <w:hyperlink w:anchor="__RefHeading___Toc7963_1259212510">
+          <w:hyperlink w:anchor="__RefHeading___Toc7940_2866894291">
             <w:r>
               <w:rPr>
                 <w:webHidden/>
@@ -1168,7 +1168,7 @@
             </w:tabs>
             <w:rPr/>
           </w:pPr>
-          <w:hyperlink w:anchor="__RefHeading___Toc7965_1259212510">
+          <w:hyperlink w:anchor="__RefHeading___Toc7942_2866894291">
             <w:r>
               <w:rPr>
                 <w:webHidden/>
@@ -1189,7 +1189,7 @@
             </w:tabs>
             <w:rPr/>
           </w:pPr>
-          <w:hyperlink w:anchor="__RefHeading___Toc7967_1259212510">
+          <w:hyperlink w:anchor="__RefHeading___Toc7944_2866894291">
             <w:r>
               <w:rPr>
                 <w:webHidden/>
@@ -1210,7 +1210,7 @@
             </w:tabs>
             <w:rPr/>
           </w:pPr>
-          <w:hyperlink w:anchor="__RefHeading___Toc7969_1259212510">
+          <w:hyperlink w:anchor="__RefHeading___Toc7946_2866894291">
             <w:r>
               <w:rPr>
                 <w:webHidden/>
@@ -1231,7 +1231,7 @@
             </w:tabs>
             <w:rPr/>
           </w:pPr>
-          <w:hyperlink w:anchor="__RefHeading___Toc7971_1259212510">
+          <w:hyperlink w:anchor="__RefHeading___Toc7948_2866894291">
             <w:r>
               <w:rPr>
                 <w:webHidden/>
@@ -1252,7 +1252,7 @@
             </w:tabs>
             <w:rPr/>
           </w:pPr>
-          <w:hyperlink w:anchor="__RefHeading___Toc7973_1259212510">
+          <w:hyperlink w:anchor="__RefHeading___Toc7950_2866894291">
             <w:r>
               <w:rPr>
                 <w:webHidden/>
@@ -1273,7 +1273,7 @@
             </w:tabs>
             <w:rPr/>
           </w:pPr>
-          <w:hyperlink w:anchor="__RefHeading___Toc7975_1259212510">
+          <w:hyperlink w:anchor="__RefHeading___Toc7952_2866894291">
             <w:r>
               <w:rPr>
                 <w:webHidden/>
@@ -1294,7 +1294,7 @@
             </w:tabs>
             <w:rPr/>
           </w:pPr>
-          <w:hyperlink w:anchor="__RefHeading___Toc7977_1259212510">
+          <w:hyperlink w:anchor="__RefHeading___Toc7954_2866894291">
             <w:r>
               <w:rPr>
                 <w:webHidden/>
@@ -1315,7 +1315,7 @@
             </w:tabs>
             <w:rPr/>
           </w:pPr>
-          <w:hyperlink w:anchor="__RefHeading___Toc7979_1259212510">
+          <w:hyperlink w:anchor="__RefHeading___Toc7956_2866894291">
             <w:r>
               <w:rPr>
                 <w:webHidden/>
@@ -1336,7 +1336,7 @@
             </w:tabs>
             <w:rPr/>
           </w:pPr>
-          <w:hyperlink w:anchor="__RefHeading___Toc7981_1259212510">
+          <w:hyperlink w:anchor="__RefHeading___Toc7958_2866894291">
             <w:r>
               <w:rPr>
                 <w:webHidden/>
@@ -1357,7 +1357,7 @@
             </w:tabs>
             <w:rPr/>
           </w:pPr>
-          <w:hyperlink w:anchor="__RefHeading___Toc7983_1259212510">
+          <w:hyperlink w:anchor="__RefHeading___Toc7960_2866894291">
             <w:r>
               <w:rPr>
                 <w:webHidden/>
@@ -1378,7 +1378,7 @@
             </w:tabs>
             <w:rPr/>
           </w:pPr>
-          <w:hyperlink w:anchor="__RefHeading___Toc7985_1259212510">
+          <w:hyperlink w:anchor="__RefHeading___Toc7962_2866894291">
             <w:r>
               <w:rPr>
                 <w:webHidden/>
@@ -1399,7 +1399,7 @@
             </w:tabs>
             <w:rPr/>
           </w:pPr>
-          <w:hyperlink w:anchor="__RefHeading___Toc7987_1259212510">
+          <w:hyperlink w:anchor="__RefHeading___Toc7964_2866894291">
             <w:r>
               <w:rPr>
                 <w:webHidden/>
@@ -1420,7 +1420,7 @@
             </w:tabs>
             <w:rPr/>
           </w:pPr>
-          <w:hyperlink w:anchor="__RefHeading___Toc7989_1259212510">
+          <w:hyperlink w:anchor="__RefHeading___Toc7966_2866894291">
             <w:r>
               <w:rPr>
                 <w:webHidden/>
@@ -1441,7 +1441,7 @@
             </w:tabs>
             <w:rPr/>
           </w:pPr>
-          <w:hyperlink w:anchor="__RefHeading___Toc7991_1259212510">
+          <w:hyperlink w:anchor="__RefHeading___Toc7968_2866894291">
             <w:r>
               <w:rPr>
                 <w:webHidden/>
@@ -1462,7 +1462,7 @@
             </w:tabs>
             <w:rPr/>
           </w:pPr>
-          <w:hyperlink w:anchor="__RefHeading___Toc7993_1259212510">
+          <w:hyperlink w:anchor="__RefHeading___Toc7970_2866894291">
             <w:r>
               <w:rPr>
                 <w:webHidden/>
@@ -1483,7 +1483,7 @@
             </w:tabs>
             <w:rPr/>
           </w:pPr>
-          <w:hyperlink w:anchor="__RefHeading___Toc7995_1259212510">
+          <w:hyperlink w:anchor="__RefHeading___Toc7972_2866894291">
             <w:r>
               <w:rPr>
                 <w:webHidden/>
@@ -1504,7 +1504,7 @@
             </w:tabs>
             <w:rPr/>
           </w:pPr>
-          <w:hyperlink w:anchor="__RefHeading___Toc7997_1259212510">
+          <w:hyperlink w:anchor="__RefHeading___Toc7974_2866894291">
             <w:r>
               <w:rPr>
                 <w:webHidden/>
@@ -1525,7 +1525,7 @@
             </w:tabs>
             <w:rPr/>
           </w:pPr>
-          <w:hyperlink w:anchor="__RefHeading___Toc7999_1259212510">
+          <w:hyperlink w:anchor="__RefHeading___Toc7976_2866894291">
             <w:r>
               <w:rPr>
                 <w:webHidden/>
@@ -1546,7 +1546,7 @@
             </w:tabs>
             <w:rPr/>
           </w:pPr>
-          <w:hyperlink w:anchor="__RefHeading___Toc8001_1259212510">
+          <w:hyperlink w:anchor="__RefHeading___Toc7978_2866894291">
             <w:r>
               <w:rPr>
                 <w:webHidden/>
@@ -1567,7 +1567,7 @@
             </w:tabs>
             <w:rPr/>
           </w:pPr>
-          <w:hyperlink w:anchor="__RefHeading___Toc8003_1259212510">
+          <w:hyperlink w:anchor="__RefHeading___Toc7980_2866894291">
             <w:r>
               <w:rPr>
                 <w:webHidden/>
@@ -1588,7 +1588,7 @@
             </w:tabs>
             <w:rPr/>
           </w:pPr>
-          <w:hyperlink w:anchor="__RefHeading___Toc8005_1259212510">
+          <w:hyperlink w:anchor="__RefHeading___Toc7982_2866894291">
             <w:r>
               <w:rPr>
                 <w:webHidden/>
@@ -1609,7 +1609,7 @@
             </w:tabs>
             <w:rPr/>
           </w:pPr>
-          <w:hyperlink w:anchor="__RefHeading___Toc8007_1259212510">
+          <w:hyperlink w:anchor="__RefHeading___Toc7984_2866894291">
             <w:r>
               <w:rPr>
                 <w:webHidden/>
@@ -1630,7 +1630,7 @@
             </w:tabs>
             <w:rPr/>
           </w:pPr>
-          <w:hyperlink w:anchor="__RefHeading___Toc8009_1259212510">
+          <w:hyperlink w:anchor="__RefHeading___Toc7986_2866894291">
             <w:r>
               <w:rPr>
                 <w:webHidden/>
@@ -1651,7 +1651,7 @@
             </w:tabs>
             <w:rPr/>
           </w:pPr>
-          <w:hyperlink w:anchor="__RefHeading___Toc8011_1259212510">
+          <w:hyperlink w:anchor="__RefHeading___Toc7988_2866894291">
             <w:r>
               <w:rPr>
                 <w:webHidden/>
@@ -1672,7 +1672,7 @@
             </w:tabs>
             <w:rPr/>
           </w:pPr>
-          <w:hyperlink w:anchor="__RefHeading___Toc8013_1259212510">
+          <w:hyperlink w:anchor="__RefHeading___Toc7990_2866894291">
             <w:r>
               <w:rPr>
                 <w:webHidden/>
@@ -1693,7 +1693,7 @@
             </w:tabs>
             <w:rPr/>
           </w:pPr>
-          <w:hyperlink w:anchor="__RefHeading___Toc8015_1259212510">
+          <w:hyperlink w:anchor="__RefHeading___Toc7992_2866894291">
             <w:r>
               <w:rPr>
                 <w:webHidden/>
@@ -1714,7 +1714,7 @@
             </w:tabs>
             <w:rPr/>
           </w:pPr>
-          <w:hyperlink w:anchor="__RefHeading___Toc8017_1259212510">
+          <w:hyperlink w:anchor="__RefHeading___Toc7994_2866894291">
             <w:r>
               <w:rPr>
                 <w:webHidden/>
@@ -1735,7 +1735,7 @@
             </w:tabs>
             <w:rPr/>
           </w:pPr>
-          <w:hyperlink w:anchor="__RefHeading___Toc8019_1259212510">
+          <w:hyperlink w:anchor="__RefHeading___Toc7996_2866894291">
             <w:r>
               <w:rPr>
                 <w:webHidden/>
@@ -1756,7 +1756,7 @@
             </w:tabs>
             <w:rPr/>
           </w:pPr>
-          <w:hyperlink w:anchor="__RefHeading___Toc8021_1259212510">
+          <w:hyperlink w:anchor="__RefHeading___Toc7998_2866894291">
             <w:r>
               <w:rPr>
                 <w:webHidden/>
@@ -1777,7 +1777,7 @@
             </w:tabs>
             <w:rPr/>
           </w:pPr>
-          <w:hyperlink w:anchor="__RefHeading___Toc8023_1259212510">
+          <w:hyperlink w:anchor="__RefHeading___Toc8000_2866894291">
             <w:r>
               <w:rPr>
                 <w:webHidden/>
@@ -1798,7 +1798,7 @@
             </w:tabs>
             <w:rPr/>
           </w:pPr>
-          <w:hyperlink w:anchor="__RefHeading___Toc8025_1259212510">
+          <w:hyperlink w:anchor="__RefHeading___Toc8002_2866894291">
             <w:r>
               <w:rPr>
                 <w:webHidden/>
@@ -1819,7 +1819,7 @@
             </w:tabs>
             <w:rPr/>
           </w:pPr>
-          <w:hyperlink w:anchor="__RefHeading___Toc8027_1259212510">
+          <w:hyperlink w:anchor="__RefHeading___Toc8004_2866894291">
             <w:r>
               <w:rPr>
                 <w:webHidden/>
@@ -1840,7 +1840,7 @@
             </w:tabs>
             <w:rPr/>
           </w:pPr>
-          <w:hyperlink w:anchor="__RefHeading___Toc8029_1259212510">
+          <w:hyperlink w:anchor="__RefHeading___Toc8006_2866894291">
             <w:r>
               <w:rPr>
                 <w:webHidden/>
@@ -1861,7 +1861,7 @@
             </w:tabs>
             <w:rPr/>
           </w:pPr>
-          <w:hyperlink w:anchor="__RefHeading___Toc8031_1259212510">
+          <w:hyperlink w:anchor="__RefHeading___Toc8008_2866894291">
             <w:r>
               <w:rPr>
                 <w:webHidden/>
@@ -1882,7 +1882,7 @@
             </w:tabs>
             <w:rPr/>
           </w:pPr>
-          <w:hyperlink w:anchor="__RefHeading___Toc8033_1259212510">
+          <w:hyperlink w:anchor="__RefHeading___Toc8010_2866894291">
             <w:r>
               <w:rPr>
                 <w:webHidden/>
@@ -1903,7 +1903,7 @@
             </w:tabs>
             <w:rPr/>
           </w:pPr>
-          <w:hyperlink w:anchor="__RefHeading___Toc8035_1259212510">
+          <w:hyperlink w:anchor="__RefHeading___Toc8012_2866894291">
             <w:r>
               <w:rPr>
                 <w:webHidden/>
@@ -1924,7 +1924,7 @@
             </w:tabs>
             <w:rPr/>
           </w:pPr>
-          <w:hyperlink w:anchor="__RefHeading___Toc8037_1259212510">
+          <w:hyperlink w:anchor="__RefHeading___Toc8014_2866894291">
             <w:r>
               <w:rPr>
                 <w:webHidden/>
@@ -1945,7 +1945,7 @@
             </w:tabs>
             <w:rPr/>
           </w:pPr>
-          <w:hyperlink w:anchor="__RefHeading___Toc8039_1259212510">
+          <w:hyperlink w:anchor="__RefHeading___Toc8016_2866894291">
             <w:r>
               <w:rPr>
                 <w:webHidden/>
@@ -1966,7 +1966,7 @@
             </w:tabs>
             <w:rPr/>
           </w:pPr>
-          <w:hyperlink w:anchor="__RefHeading___Toc8041_1259212510">
+          <w:hyperlink w:anchor="__RefHeading___Toc8018_2866894291">
             <w:r>
               <w:rPr>
                 <w:webHidden/>
@@ -1987,7 +1987,7 @@
             </w:tabs>
             <w:rPr/>
           </w:pPr>
-          <w:hyperlink w:anchor="__RefHeading___Toc8043_1259212510">
+          <w:hyperlink w:anchor="__RefHeading___Toc8020_2866894291">
             <w:r>
               <w:rPr>
                 <w:webHidden/>
@@ -2008,7 +2008,7 @@
             </w:tabs>
             <w:rPr/>
           </w:pPr>
-          <w:hyperlink w:anchor="__RefHeading___Toc8045_1259212510">
+          <w:hyperlink w:anchor="__RefHeading___Toc8022_2866894291">
             <w:r>
               <w:rPr>
                 <w:webHidden/>
@@ -2029,7 +2029,7 @@
             </w:tabs>
             <w:rPr/>
           </w:pPr>
-          <w:hyperlink w:anchor="__RefHeading___Toc8047_1259212510">
+          <w:hyperlink w:anchor="__RefHeading___Toc8024_2866894291">
             <w:r>
               <w:rPr>
                 <w:webHidden/>
@@ -2050,7 +2050,7 @@
             </w:tabs>
             <w:rPr/>
           </w:pPr>
-          <w:hyperlink w:anchor="__RefHeading___Toc8049_1259212510">
+          <w:hyperlink w:anchor="__RefHeading___Toc8026_2866894291">
             <w:r>
               <w:rPr>
                 <w:webHidden/>
@@ -2071,7 +2071,7 @@
             </w:tabs>
             <w:rPr/>
           </w:pPr>
-          <w:hyperlink w:anchor="__RefHeading___Toc8051_1259212510">
+          <w:hyperlink w:anchor="__RefHeading___Toc8028_2866894291">
             <w:r>
               <w:rPr>
                 <w:webHidden/>
@@ -2092,7 +2092,7 @@
             </w:tabs>
             <w:rPr/>
           </w:pPr>
-          <w:hyperlink w:anchor="__RefHeading___Toc8053_1259212510">
+          <w:hyperlink w:anchor="__RefHeading___Toc8030_2866894291">
             <w:r>
               <w:rPr>
                 <w:webHidden/>
@@ -2113,7 +2113,7 @@
             </w:tabs>
             <w:rPr/>
           </w:pPr>
-          <w:hyperlink w:anchor="__RefHeading___Toc8055_1259212510">
+          <w:hyperlink w:anchor="__RefHeading___Toc8032_2866894291">
             <w:r>
               <w:rPr>
                 <w:webHidden/>
@@ -2134,7 +2134,7 @@
             </w:tabs>
             <w:rPr/>
           </w:pPr>
-          <w:hyperlink w:anchor="__RefHeading___Toc8057_1259212510">
+          <w:hyperlink w:anchor="__RefHeading___Toc8034_2866894291">
             <w:r>
               <w:rPr>
                 <w:webHidden/>
@@ -2155,7 +2155,7 @@
             </w:tabs>
             <w:rPr/>
           </w:pPr>
-          <w:hyperlink w:anchor="__RefHeading___Toc8059_1259212510">
+          <w:hyperlink w:anchor="__RefHeading___Toc8036_2866894291">
             <w:r>
               <w:rPr>
                 <w:webHidden/>
@@ -2176,7 +2176,7 @@
             </w:tabs>
             <w:rPr/>
           </w:pPr>
-          <w:hyperlink w:anchor="__RefHeading___Toc8061_1259212510">
+          <w:hyperlink w:anchor="__RefHeading___Toc8038_2866894291">
             <w:r>
               <w:rPr>
                 <w:webHidden/>
@@ -3869,7 +3869,7 @@
         <w:spacing w:before="0" w:after="120"/>
         <w:rPr/>
       </w:pPr>
-      <w:bookmarkStart w:id="2" w:name="__RefHeading___Toc7869_1259212510"/>
+      <w:bookmarkStart w:id="2" w:name="__RefHeading___Toc7846_2866894291"/>
       <w:bookmarkEnd w:id="2"/>
       <w:r>
         <w:rPr>
@@ -3907,7 +3907,7 @@
         <w:rPr>
           <w:sz w:val="20"/>
         </w:rPr>
-        <w:t xml:space="preserve"> 2026-09-29</w:t>
+        <w:t xml:space="preserve"> 2026-09-30</w:t>
       </w:r>
     </w:p>
     <w:p>
@@ -4007,7 +4007,7 @@
         <w:spacing w:before="360" w:after="120"/>
         <w:rPr/>
       </w:pPr>
-      <w:bookmarkStart w:id="4" w:name="__RefHeading___Toc7871_1259212510"/>
+      <w:bookmarkStart w:id="4" w:name="__RefHeading___Toc7848_2866894291"/>
       <w:bookmarkStart w:id="5" w:name="document-information"/>
       <w:bookmarkEnd w:id="4"/>
       <w:r>
@@ -4039,7 +4039,7 @@
         <w:spacing w:before="280" w:after="80"/>
         <w:rPr/>
       </w:pPr>
-      <w:bookmarkStart w:id="6" w:name="__RefHeading___Toc7873_1259212510"/>
+      <w:bookmarkStart w:id="6" w:name="__RefHeading___Toc7850_2866894291"/>
       <w:bookmarkEnd w:id="6"/>
       <w:r>
         <w:rPr>
@@ -4496,7 +4496,7 @@
       <w:r>
         <w:br w:type="page"/>
       </w:r>
-      <w:bookmarkStart w:id="8" w:name="__RefHeading___Toc7875_1259212510"/>
+      <w:bookmarkStart w:id="8" w:name="__RefHeading___Toc7852_2866894291"/>
       <w:bookmarkEnd w:id="8"/>
       <w:r>
         <w:rPr>
@@ -4827,7 +4827,7 @@
       <w:r>
         <w:br w:type="page"/>
       </w:r>
-      <w:bookmarkStart w:id="9" w:name="__RefHeading___Toc7877_1259212510"/>
+      <w:bookmarkStart w:id="9" w:name="__RefHeading___Toc7854_2866894291"/>
       <w:bookmarkEnd w:id="9"/>
       <w:r>
         <w:rPr>
@@ -4979,7 +4979,7 @@
         <w:spacing w:before="280" w:after="80"/>
         <w:rPr/>
       </w:pPr>
-      <w:bookmarkStart w:id="10" w:name="__RefHeading___Toc7879_1259212510"/>
+      <w:bookmarkStart w:id="10" w:name="__RefHeading___Toc7856_2866894291"/>
       <w:bookmarkStart w:id="11" w:name="intended-audience"/>
       <w:bookmarkEnd w:id="10"/>
       <w:r>
@@ -5071,7 +5071,7 @@
         <w:spacing w:before="280" w:after="80"/>
         <w:rPr/>
       </w:pPr>
-      <w:bookmarkStart w:id="13" w:name="__RefHeading___Toc7881_1259212510"/>
+      <w:bookmarkStart w:id="13" w:name="__RefHeading___Toc7858_2866894291"/>
       <w:bookmarkStart w:id="14" w:name="related-documents"/>
       <w:bookmarkEnd w:id="13"/>
       <w:r>
@@ -5818,7 +5818,7 @@
         <w:spacing w:before="360" w:after="120"/>
         <w:rPr/>
       </w:pPr>
-      <w:bookmarkStart w:id="18" w:name="__RefHeading___Toc7883_1259212510"/>
+      <w:bookmarkStart w:id="18" w:name="__RefHeading___Toc7860_2866894291"/>
       <w:bookmarkStart w:id="19" w:name="purpose-and-scope"/>
       <w:bookmarkEnd w:id="18"/>
       <w:r>
@@ -5850,7 +5850,7 @@
         <w:spacing w:before="280" w:after="80"/>
         <w:rPr/>
       </w:pPr>
-      <w:bookmarkStart w:id="20" w:name="__RefHeading___Toc7885_1259212510"/>
+      <w:bookmarkStart w:id="20" w:name="__RefHeading___Toc7862_2866894291"/>
       <w:bookmarkStart w:id="21" w:name="purpose"/>
       <w:bookmarkEnd w:id="20"/>
       <w:r>
@@ -5910,7 +5910,7 @@
         <w:spacing w:before="280" w:after="80"/>
         <w:rPr/>
       </w:pPr>
-      <w:bookmarkStart w:id="23" w:name="__RefHeading___Toc7887_1259212510"/>
+      <w:bookmarkStart w:id="23" w:name="__RefHeading___Toc7864_2866894291"/>
       <w:bookmarkStart w:id="24" w:name="scope"/>
       <w:bookmarkEnd w:id="23"/>
       <w:r>
@@ -6132,7 +6132,7 @@
         <w:spacing w:before="280" w:after="80"/>
         <w:rPr/>
       </w:pPr>
-      <w:bookmarkStart w:id="26" w:name="__RefHeading___Toc7889_1259212510"/>
+      <w:bookmarkStart w:id="26" w:name="__RefHeading___Toc7866_2866894291"/>
       <w:bookmarkStart w:id="27" w:name="where-this-document-stands"/>
       <w:bookmarkEnd w:id="26"/>
       <w:r>
@@ -6278,7 +6278,7 @@
         <w:spacing w:before="360" w:after="120"/>
         <w:rPr/>
       </w:pPr>
-      <w:bookmarkStart w:id="30" w:name="__RefHeading___Toc7891_1259212510"/>
+      <w:bookmarkStart w:id="30" w:name="__RefHeading___Toc7868_2866894291"/>
       <w:bookmarkStart w:id="31" w:name="document-conventions"/>
       <w:bookmarkEnd w:id="30"/>
       <w:r>
@@ -6310,7 +6310,7 @@
         <w:spacing w:before="280" w:after="80"/>
         <w:rPr/>
       </w:pPr>
-      <w:bookmarkStart w:id="32" w:name="__RefHeading___Toc7893_1259212510"/>
+      <w:bookmarkStart w:id="32" w:name="__RefHeading___Toc7870_2866894291"/>
       <w:bookmarkStart w:id="33" w:name="terminology"/>
       <w:bookmarkEnd w:id="32"/>
       <w:r>
@@ -6521,7 +6521,7 @@
         <w:spacing w:before="280" w:after="80"/>
         <w:rPr/>
       </w:pPr>
-      <w:bookmarkStart w:id="34" w:name="__RefHeading___Toc7895_1259212510"/>
+      <w:bookmarkStart w:id="34" w:name="__RefHeading___Toc7872_2866894291"/>
       <w:bookmarkStart w:id="35" w:name="naming"/>
       <w:bookmarkEnd w:id="34"/>
       <w:r>
@@ -6672,7 +6672,7 @@
         <w:spacing w:before="280" w:after="80"/>
         <w:rPr/>
       </w:pPr>
-      <w:bookmarkStart w:id="36" w:name="__RefHeading___Toc7897_1259212510"/>
+      <w:bookmarkStart w:id="36" w:name="__RefHeading___Toc7874_2866894291"/>
       <w:bookmarkStart w:id="37" w:name="notation"/>
       <w:bookmarkEnd w:id="36"/>
       <w:r>
@@ -6764,7 +6764,7 @@
         <w:spacing w:before="280" w:after="80"/>
         <w:rPr/>
       </w:pPr>
-      <w:bookmarkStart w:id="39" w:name="__RefHeading___Toc7899_1259212510"/>
+      <w:bookmarkStart w:id="39" w:name="__RefHeading___Toc7876_2866894291"/>
       <w:bookmarkStart w:id="40" w:name="decision-markers"/>
       <w:bookmarkEnd w:id="39"/>
       <w:r>
@@ -6911,7 +6911,7 @@
         <w:spacing w:before="360" w:after="120"/>
         <w:rPr/>
       </w:pPr>
-      <w:bookmarkStart w:id="43" w:name="__RefHeading___Toc7901_1259212510"/>
+      <w:bookmarkStart w:id="43" w:name="__RefHeading___Toc7878_2866894291"/>
       <w:bookmarkStart w:id="44" w:name="definitions-and-acronyms"/>
       <w:bookmarkEnd w:id="43"/>
       <w:r>
@@ -8329,7 +8329,7 @@
         <w:spacing w:before="360" w:after="120"/>
         <w:rPr/>
       </w:pPr>
-      <w:bookmarkStart w:id="47" w:name="__RefHeading___Toc7903_1259212510"/>
+      <w:bookmarkStart w:id="47" w:name="__RefHeading___Toc7880_2866894291"/>
       <w:bookmarkStart w:id="48" w:name="use-cases"/>
       <w:bookmarkEnd w:id="47"/>
       <w:r>
@@ -8375,7 +8375,7 @@
         <w:spacing w:before="280" w:after="80"/>
         <w:rPr/>
       </w:pPr>
-      <w:bookmarkStart w:id="49" w:name="__RefHeading___Toc7905_1259212510"/>
+      <w:bookmarkStart w:id="49" w:name="__RefHeading___Toc7882_2866894291"/>
       <w:bookmarkStart w:id="50" w:name="memory-controller-ecc"/>
       <w:bookmarkEnd w:id="49"/>
       <w:r>
@@ -8423,7 +8423,7 @@
         <w:spacing w:before="280" w:after="80"/>
         <w:rPr/>
       </w:pPr>
-      <w:bookmarkStart w:id="52" w:name="__RefHeading___Toc7907_1259212510"/>
+      <w:bookmarkStart w:id="52" w:name="__RefHeading___Toc7884_2866894291"/>
       <w:bookmarkStart w:id="53" w:name="serial-link-forward-error-correction"/>
       <w:bookmarkEnd w:id="52"/>
       <w:r>
@@ -8483,7 +8483,7 @@
         <w:spacing w:before="280" w:after="80"/>
         <w:rPr/>
       </w:pPr>
-      <w:bookmarkStart w:id="54" w:name="__RefHeading___Toc7909_1259212510"/>
+      <w:bookmarkStart w:id="54" w:name="__RefHeading___Toc7886_2866894291"/>
       <w:bookmarkStart w:id="55" w:name="storage-erasure-coding"/>
       <w:bookmarkEnd w:id="54"/>
       <w:r>
@@ -8531,7 +8531,7 @@
         <w:spacing w:before="280" w:after="80"/>
         <w:rPr/>
       </w:pPr>
-      <w:bookmarkStart w:id="57" w:name="__RefHeading___Toc7911_1259212510"/>
+      <w:bookmarkStart w:id="57" w:name="__RefHeading___Toc7888_2866894291"/>
       <w:bookmarkStart w:id="58" w:name="standalone-codec-on-a-fabric-port"/>
       <w:bookmarkEnd w:id="57"/>
       <w:r>
@@ -8579,7 +8579,7 @@
         <w:spacing w:before="280" w:after="80"/>
         <w:rPr/>
       </w:pPr>
-      <w:bookmarkStart w:id="60" w:name="__RefHeading___Toc7913_1259212510"/>
+      <w:bookmarkStart w:id="60" w:name="__RefHeading___Toc7890_2866894291"/>
       <w:bookmarkStart w:id="61" w:name="memory-to-memory-job-engine"/>
       <w:bookmarkEnd w:id="60"/>
       <w:r>
@@ -9880,7 +9880,7 @@
         <w:spacing w:before="360" w:after="120"/>
         <w:rPr/>
       </w:pPr>
-      <w:bookmarkStart w:id="65" w:name="__RefHeading___Toc7915_1259212510"/>
+      <w:bookmarkStart w:id="65" w:name="__RefHeading___Toc7892_2866894291"/>
       <w:bookmarkStart w:id="66" w:name="key-features"/>
       <w:bookmarkEnd w:id="65"/>
       <w:r>
@@ -9912,7 +9912,7 @@
         <w:spacing w:before="280" w:after="80"/>
         <w:rPr/>
       </w:pPr>
-      <w:bookmarkStart w:id="67" w:name="__RefHeading___Toc7917_1259212510"/>
+      <w:bookmarkStart w:id="67" w:name="__RefHeading___Toc7894_2866894291"/>
       <w:bookmarkStart w:id="68" w:name="decided-prd-section-3"/>
       <w:bookmarkEnd w:id="67"/>
       <w:r>
@@ -10285,7 +10285,7 @@
         <w:spacing w:before="280" w:after="80"/>
         <w:rPr/>
       </w:pPr>
-      <w:bookmarkStart w:id="69" w:name="__RefHeading___Toc7919_1259212510"/>
+      <w:bookmarkStart w:id="69" w:name="__RefHeading___Toc7896_2866894291"/>
       <w:bookmarkStart w:id="70" w:name="configurable-not-yet-chosen-chapter-6.2"/>
       <w:bookmarkEnd w:id="69"/>
       <w:r>
@@ -10405,7 +10405,7 @@
         <w:spacing w:before="280" w:after="80"/>
         <w:rPr/>
       </w:pPr>
-      <w:bookmarkStart w:id="72" w:name="__RefHeading___Toc7921_1259212510"/>
+      <w:bookmarkStart w:id="72" w:name="__RefHeading___Toc7898_2866894291"/>
       <w:bookmarkStart w:id="73" w:name="explicitly-not-features"/>
       <w:bookmarkEnd w:id="72"/>
       <w:r>
@@ -10540,7 +10540,7 @@
         <w:spacing w:before="360" w:after="120"/>
         <w:rPr/>
       </w:pPr>
-      <w:bookmarkStart w:id="76" w:name="__RefHeading___Toc7923_1259212510"/>
+      <w:bookmarkStart w:id="76" w:name="__RefHeading___Toc7900_2866894291"/>
       <w:bookmarkStart w:id="77" w:name="system-context"/>
       <w:bookmarkEnd w:id="76"/>
       <w:r>
@@ -10572,7 +10572,7 @@
         <w:spacing w:before="280" w:after="80"/>
         <w:rPr/>
       </w:pPr>
-      <w:bookmarkStart w:id="78" w:name="__RefHeading___Toc7925_1259212510"/>
+      <w:bookmarkStart w:id="78" w:name="__RefHeading___Toc7902_2866894291"/>
       <w:bookmarkStart w:id="79" w:name="X539b6d745109ccf7f3d8906eebe232bff3e0f79"/>
       <w:bookmarkEnd w:id="78"/>
       <w:r>
@@ -10637,7 +10637,7 @@
         <w:spacing w:before="200" w:after="80"/>
         <w:rPr/>
       </w:pPr>
-      <w:bookmarkStart w:id="80" w:name="__RefHeading___Toc7927_1259212510"/>
+      <w:bookmarkStart w:id="80" w:name="__RefHeading___Toc7904_2866894291"/>
       <w:bookmarkStart w:id="81" w:name="figure-2.1-where-the-codec-sits"/>
       <w:bookmarkStart w:id="82" w:name="_Fig_1_Where_the_codec_sits"/>
       <w:bookmarkEnd w:id="80"/>
@@ -10745,7 +10745,7 @@
         <w:spacing w:before="280" w:after="80"/>
         <w:rPr/>
       </w:pPr>
-      <w:bookmarkStart w:id="85" w:name="__RefHeading___Toc7929_1259212510"/>
+      <w:bookmarkStart w:id="85" w:name="__RefHeading___Toc7906_2866894291"/>
       <w:bookmarkStart w:id="86" w:name="the-core-inside-a-consumer"/>
       <w:bookmarkEnd w:id="85"/>
       <w:r>
@@ -10793,7 +10793,7 @@
         <w:spacing w:before="280" w:after="80"/>
         <w:rPr/>
       </w:pPr>
-      <w:bookmarkStart w:id="88" w:name="__RefHeading___Toc7931_1259212510"/>
+      <w:bookmarkStart w:id="88" w:name="__RefHeading___Toc7908_2866894291"/>
       <w:bookmarkStart w:id="89" w:name="the-standalone-tops"/>
       <w:bookmarkEnd w:id="88"/>
       <w:r>
@@ -10841,7 +10841,7 @@
         <w:spacing w:before="280" w:after="80"/>
         <w:rPr/>
       </w:pPr>
-      <w:bookmarkStart w:id="91" w:name="__RefHeading___Toc7933_1259212510"/>
+      <w:bookmarkStart w:id="91" w:name="__RefHeading___Toc7910_2866894291"/>
       <w:bookmarkStart w:id="92" w:name="Xe0d658dd7c77babbf288aebe2e92261f3c8c6d7"/>
       <w:bookmarkEnd w:id="91"/>
       <w:r>
@@ -11921,7 +11921,7 @@
         <w:spacing w:before="360" w:after="120"/>
         <w:rPr/>
       </w:pPr>
-      <w:bookmarkStart w:id="96" w:name="__RefHeading___Toc7935_1259212510"/>
+      <w:bookmarkStart w:id="96" w:name="__RefHeading___Toc7912_2866894291"/>
       <w:bookmarkStart w:id="97" w:name="block-diagram"/>
       <w:bookmarkEnd w:id="96"/>
       <w:r>
@@ -11949,7 +11949,7 @@
         <w:spacing w:before="200" w:after="80"/>
         <w:rPr/>
       </w:pPr>
-      <w:bookmarkStart w:id="98" w:name="__RefHeading___Toc7937_1259212510"/>
+      <w:bookmarkStart w:id="98" w:name="__RefHeading___Toc7914_2866894291"/>
       <w:bookmarkStart w:id="99" w:name="figure-3.1-codec-block-diagram"/>
       <w:bookmarkStart w:id="100" w:name="_Fig_2_Codec_block_diagram"/>
       <w:bookmarkEnd w:id="98"/>
@@ -12055,7 +12055,7 @@
         <w:spacing w:before="280" w:after="80"/>
         <w:rPr/>
       </w:pPr>
-      <w:bookmarkStart w:id="102" w:name="__RefHeading___Toc7939_1259212510"/>
+      <w:bookmarkStart w:id="102" w:name="__RefHeading___Toc7916_2866894291"/>
       <w:bookmarkStart w:id="103" w:name="the-encoder-core"/>
       <w:bookmarkEnd w:id="102"/>
       <w:r>
@@ -12180,7 +12180,7 @@
         <w:spacing w:before="280" w:after="80"/>
         <w:rPr/>
       </w:pPr>
-      <w:bookmarkStart w:id="104" w:name="__RefHeading___Toc7941_1259212510"/>
+      <w:bookmarkStart w:id="104" w:name="__RefHeading___Toc7918_2866894291"/>
       <w:bookmarkStart w:id="105" w:name="the-decoder-core"/>
       <w:bookmarkEnd w:id="104"/>
       <w:r>
@@ -12318,7 +12318,7 @@
         <w:spacing w:before="280" w:after="80"/>
         <w:rPr/>
       </w:pPr>
-      <w:bookmarkStart w:id="106" w:name="__RefHeading___Toc7943_1259212510"/>
+      <w:bookmarkStart w:id="106" w:name="__RefHeading___Toc7920_2866894291"/>
       <w:bookmarkStart w:id="107" w:name="the-gf-layer"/>
       <w:bookmarkEnd w:id="106"/>
       <w:r>
@@ -12411,7 +12411,7 @@
         <w:spacing w:before="280" w:after="80"/>
         <w:rPr/>
       </w:pPr>
-      <w:bookmarkStart w:id="108" w:name="__RefHeading___Toc7945_1259212510"/>
+      <w:bookmarkStart w:id="108" w:name="__RefHeading___Toc7922_2866894291"/>
       <w:bookmarkStart w:id="109" w:name="the-adapters"/>
       <w:bookmarkEnd w:id="108"/>
       <w:r>
@@ -12523,7 +12523,7 @@
         <w:spacing w:before="280" w:after="80"/>
         <w:rPr/>
       </w:pPr>
-      <w:bookmarkStart w:id="110" w:name="__RefHeading___Toc7947_1259212510"/>
+      <w:bookmarkStart w:id="110" w:name="__RefHeading___Toc7924_2866894291"/>
       <w:bookmarkStart w:id="111" w:name="hierarchy"/>
       <w:bookmarkEnd w:id="110"/>
       <w:r>
@@ -12669,7 +12669,7 @@
         <w:spacing w:before="360" w:after="120"/>
         <w:rPr/>
       </w:pPr>
-      <w:bookmarkStart w:id="114" w:name="__RefHeading___Toc7949_1259212510"/>
+      <w:bookmarkStart w:id="114" w:name="__RefHeading___Toc7926_2866894291"/>
       <w:bookmarkStart w:id="115" w:name="data-flow"/>
       <w:bookmarkEnd w:id="114"/>
       <w:r>
@@ -12701,7 +12701,7 @@
         <w:spacing w:before="280" w:after="80"/>
         <w:rPr/>
       </w:pPr>
-      <w:bookmarkStart w:id="116" w:name="__RefHeading___Toc7951_1259212510"/>
+      <w:bookmarkStart w:id="116" w:name="__RefHeading___Toc7928_2866894291"/>
       <w:bookmarkStart w:id="117" w:name="encoder"/>
       <w:bookmarkEnd w:id="116"/>
       <w:r>
@@ -12864,7 +12864,7 @@
         <w:spacing w:before="280" w:after="80"/>
         <w:rPr/>
       </w:pPr>
-      <w:bookmarkStart w:id="118" w:name="__RefHeading___Toc7953_1259212510"/>
+      <w:bookmarkStart w:id="118" w:name="__RefHeading___Toc7930_2866894291"/>
       <w:bookmarkStart w:id="119" w:name="decoder"/>
       <w:bookmarkEnd w:id="118"/>
       <w:r>
@@ -12994,7 +12994,7 @@
         <w:spacing w:before="200" w:after="80"/>
         <w:rPr/>
       </w:pPr>
-      <w:bookmarkStart w:id="120" w:name="__RefHeading___Toc7955_1259212510"/>
+      <w:bookmarkStart w:id="120" w:name="__RefHeading___Toc7932_2866894291"/>
       <w:bookmarkStart w:id="121" w:name="Xdf366d42c74e96f28b1631efb3302710e6b6281"/>
       <w:bookmarkStart w:id="122" w:name="_Fig_3_Decoder_timeline__on"/>
       <w:bookmarkEnd w:id="120"/>
@@ -13102,7 +13102,7 @@
         <w:spacing w:before="280" w:after="80"/>
         <w:rPr/>
       </w:pPr>
-      <w:bookmarkStart w:id="125" w:name="__RefHeading___Toc7957_1259212510"/>
+      <w:bookmarkStart w:id="125" w:name="__RefHeading___Toc7934_2866894291"/>
       <w:bookmarkStart w:id="126" w:name="block-boundaries"/>
       <w:bookmarkEnd w:id="125"/>
       <w:r>
@@ -13188,7 +13188,7 @@
         <w:spacing w:before="280" w:after="80"/>
         <w:rPr/>
       </w:pPr>
-      <w:bookmarkStart w:id="127" w:name="__RefHeading___Toc7959_1259212510"/>
+      <w:bookmarkStart w:id="127" w:name="__RefHeading___Toc7936_2866894291"/>
       <w:bookmarkStart w:id="128" w:name="multiple-symbols-per-beat"/>
       <w:bookmarkEnd w:id="127"/>
       <w:r>
@@ -13347,7 +13347,7 @@
         <w:spacing w:before="360" w:after="120"/>
         <w:rPr/>
       </w:pPr>
-      <w:bookmarkStart w:id="131" w:name="__RefHeading___Toc7961_1259212510"/>
+      <w:bookmarkStart w:id="131" w:name="__RefHeading___Toc7938_2866894291"/>
       <w:bookmarkStart w:id="132" w:name="solver-options"/>
       <w:bookmarkEnd w:id="131"/>
       <w:r>
@@ -14473,7 +14473,7 @@
         <w:spacing w:before="360" w:after="120"/>
         <w:rPr/>
       </w:pPr>
-      <w:bookmarkStart w:id="135" w:name="__RefHeading___Toc7963_1259212510"/>
+      <w:bookmarkStart w:id="135" w:name="__RefHeading___Toc7940_2866894291"/>
       <w:bookmarkStart w:id="136" w:name="core-interface"/>
       <w:bookmarkEnd w:id="135"/>
       <w:r>
@@ -14675,7 +14675,7 @@
         <w:spacing w:before="280" w:after="80"/>
         <w:rPr/>
       </w:pPr>
-      <w:bookmarkStart w:id="137" w:name="__RefHeading___Toc7965_1259212510"/>
+      <w:bookmarkStart w:id="137" w:name="__RefHeading___Toc7942_2866894291"/>
       <w:bookmarkEnd w:id="137"/>
       <w:r>
         <w:rPr>
@@ -15147,7 +15147,7 @@
       <w:r>
         <w:br w:type="page"/>
       </w:r>
-      <w:bookmarkStart w:id="140" w:name="__RefHeading___Toc7967_1259212510"/>
+      <w:bookmarkStart w:id="140" w:name="__RefHeading___Toc7944_2866894291"/>
       <w:bookmarkEnd w:id="140"/>
       <w:r>
         <w:rPr>
@@ -16768,7 +16768,7 @@
       <w:r>
         <w:br w:type="page"/>
       </w:r>
-      <w:bookmarkStart w:id="142" w:name="__RefHeading___Toc7969_1259212510"/>
+      <w:bookmarkStart w:id="142" w:name="__RefHeading___Toc7946_2866894291"/>
       <w:bookmarkEnd w:id="142"/>
       <w:r>
         <w:rPr>
@@ -18783,7 +18783,7 @@
       <w:r>
         <w:br w:type="page"/>
       </w:r>
-      <w:bookmarkStart w:id="144" w:name="__RefHeading___Toc7971_1259212510"/>
+      <w:bookmarkStart w:id="144" w:name="__RefHeading___Toc7948_2866894291"/>
       <w:bookmarkEnd w:id="144"/>
       <w:r>
         <w:rPr>
@@ -18932,7 +18932,7 @@
         <w:spacing w:before="280" w:after="80"/>
         <w:rPr/>
       </w:pPr>
-      <w:bookmarkStart w:id="145" w:name="__RefHeading___Toc7973_1259212510"/>
+      <w:bookmarkStart w:id="145" w:name="__RefHeading___Toc7950_2866894291"/>
       <w:bookmarkStart w:id="146" w:name="erasures-enable_erasures-prd-d5-tbd"/>
       <w:bookmarkEnd w:id="145"/>
       <w:r>
@@ -19095,7 +19095,7 @@
         <w:spacing w:before="360" w:after="120"/>
         <w:rPr/>
       </w:pPr>
-      <w:bookmarkStart w:id="149" w:name="__RefHeading___Toc7975_1259212510"/>
+      <w:bookmarkStart w:id="149" w:name="__RefHeading___Toc7952_2866894291"/>
       <w:bookmarkStart w:id="150" w:name="axi-stream-adapter"/>
       <w:bookmarkEnd w:id="149"/>
       <w:r>
@@ -20171,7 +20171,7 @@
       <w:r>
         <w:br w:type="page"/>
       </w:r>
-      <w:bookmarkStart w:id="152" w:name="__RefHeading___Toc7977_1259212510"/>
+      <w:bookmarkStart w:id="152" w:name="__RefHeading___Toc7954_2866894291"/>
       <w:bookmarkEnd w:id="152"/>
       <w:r>
         <w:rPr>
@@ -20698,7 +20698,7 @@
       <w:r>
         <w:br w:type="page"/>
       </w:r>
-      <w:bookmarkStart w:id="154" w:name="__RefHeading___Toc7979_1259212510"/>
+      <w:bookmarkStart w:id="154" w:name="__RefHeading___Toc7956_2866894291"/>
       <w:bookmarkEnd w:id="154"/>
       <w:r>
         <w:rPr>
@@ -20828,7 +20828,7 @@
         <w:spacing w:before="360" w:after="120"/>
         <w:rPr/>
       </w:pPr>
-      <w:bookmarkStart w:id="156" w:name="__RefHeading___Toc7981_1259212510"/>
+      <w:bookmarkStart w:id="156" w:name="__RefHeading___Toc7958_2866894291"/>
       <w:bookmarkStart w:id="157" w:name="axi4-job-adapter"/>
       <w:bookmarkEnd w:id="156"/>
       <w:r>
@@ -20913,7 +20913,7 @@
         <w:spacing w:before="280" w:after="80"/>
         <w:rPr/>
       </w:pPr>
-      <w:bookmarkStart w:id="158" w:name="__RefHeading___Toc7983_1259212510"/>
+      <w:bookmarkStart w:id="158" w:name="__RefHeading___Toc7960_2866894291"/>
       <w:bookmarkEnd w:id="158"/>
       <w:r>
         <w:rPr>
@@ -21523,7 +21523,7 @@
       <w:r>
         <w:br w:type="page"/>
       </w:r>
-      <w:bookmarkStart w:id="161" w:name="__RefHeading___Toc7985_1259212510"/>
+      <w:bookmarkStart w:id="161" w:name="__RefHeading___Toc7962_2866894291"/>
       <w:bookmarkEnd w:id="161"/>
       <w:r>
         <w:rPr>
@@ -21659,7 +21659,7 @@
         <w:spacing w:before="280" w:after="80"/>
         <w:rPr/>
       </w:pPr>
-      <w:bookmarkStart w:id="162" w:name="__RefHeading___Toc7987_1259212510"/>
+      <w:bookmarkStart w:id="162" w:name="__RefHeading___Toc7964_2866894291"/>
       <w:bookmarkEnd w:id="162"/>
       <w:r>
         <w:rPr>
@@ -22380,7 +22380,7 @@
       <w:r>
         <w:br w:type="page"/>
       </w:r>
-      <w:bookmarkStart w:id="165" w:name="__RefHeading___Toc7989_1259212510"/>
+      <w:bookmarkStart w:id="165" w:name="__RefHeading___Toc7966_2866894291"/>
       <w:bookmarkEnd w:id="165"/>
       <w:r>
         <w:rPr>
@@ -22536,7 +22536,7 @@
         <w:spacing w:before="360" w:after="120"/>
         <w:rPr/>
       </w:pPr>
-      <w:bookmarkStart w:id="167" w:name="__RefHeading___Toc7991_1259212510"/>
+      <w:bookmarkStart w:id="167" w:name="__RefHeading___Toc7968_2866894291"/>
       <w:bookmarkStart w:id="168" w:name="register-block"/>
       <w:bookmarkEnd w:id="167"/>
       <w:r>
@@ -24116,7 +24116,7 @@
         <w:spacing w:before="360" w:after="120"/>
         <w:rPr/>
       </w:pPr>
-      <w:bookmarkStart w:id="171" w:name="__RefHeading___Toc7993_1259212510"/>
+      <w:bookmarkStart w:id="171" w:name="__RefHeading___Toc7970_2866894291"/>
       <w:bookmarkStart w:id="172" w:name="clock-and-reset-1"/>
       <w:bookmarkEnd w:id="171"/>
       <w:r>
@@ -24148,7 +24148,7 @@
         <w:spacing w:before="280" w:after="80"/>
         <w:rPr/>
       </w:pPr>
-      <w:bookmarkStart w:id="173" w:name="__RefHeading___Toc7995_1259212510"/>
+      <w:bookmarkStart w:id="173" w:name="__RefHeading___Toc7972_2866894291"/>
       <w:bookmarkStart w:id="174" w:name="single-clock"/>
       <w:bookmarkEnd w:id="173"/>
       <w:r>
@@ -24234,7 +24234,7 @@
         <w:spacing w:before="280" w:after="80"/>
         <w:rPr/>
       </w:pPr>
-      <w:bookmarkStart w:id="175" w:name="__RefHeading___Toc7997_1259212510"/>
+      <w:bookmarkStart w:id="175" w:name="__RefHeading___Toc7974_2866894291"/>
       <w:bookmarkStart w:id="176" w:name="reset"/>
       <w:bookmarkEnd w:id="175"/>
       <w:r>
@@ -24327,7 +24327,7 @@
         <w:spacing w:before="280" w:after="80"/>
         <w:rPr/>
       </w:pPr>
-      <w:bookmarkStart w:id="177" w:name="__RefHeading___Toc7999_1259212510"/>
+      <w:bookmarkStart w:id="177" w:name="__RefHeading___Toc7976_2866894291"/>
       <w:bookmarkStart w:id="178" w:name="clock-gating"/>
       <w:bookmarkEnd w:id="177"/>
       <w:r>
@@ -24387,7 +24387,7 @@
         <w:spacing w:before="280" w:after="80"/>
         <w:rPr/>
       </w:pPr>
-      <w:bookmarkStart w:id="179" w:name="__RefHeading___Toc8001_1259212510"/>
+      <w:bookmarkStart w:id="179" w:name="__RefHeading___Toc7978_2866894291"/>
       <w:bookmarkStart w:id="180" w:name="frequency"/>
       <w:bookmarkEnd w:id="179"/>
       <w:r>
@@ -24520,7 +24520,7 @@
         <w:spacing w:before="360" w:after="120"/>
         <w:rPr/>
       </w:pPr>
-      <w:bookmarkStart w:id="183" w:name="__RefHeading___Toc8003_1259212510"/>
+      <w:bookmarkStart w:id="183" w:name="__RefHeading___Toc7980_2866894291"/>
       <w:bookmarkStart w:id="184" w:name="throughput"/>
       <w:bookmarkEnd w:id="183"/>
       <w:r>
@@ -24566,7 +24566,7 @@
         <w:spacing w:before="280" w:after="80"/>
         <w:rPr/>
       </w:pPr>
-      <w:bookmarkStart w:id="185" w:name="__RefHeading___Toc8005_1259212510"/>
+      <w:bookmarkStart w:id="185" w:name="__RefHeading___Toc7982_2866894291"/>
       <w:bookmarkStart w:id="186" w:name="sustained-rate"/>
       <w:bookmarkEnd w:id="185"/>
       <w:r>
@@ -25076,7 +25076,7 @@
         <w:spacing w:before="280" w:after="80"/>
         <w:rPr/>
       </w:pPr>
-      <w:bookmarkStart w:id="189" w:name="__RefHeading___Toc8007_1259212510"/>
+      <w:bookmarkStart w:id="189" w:name="__RefHeading___Toc7984_2866894291"/>
       <w:bookmarkStart w:id="190" w:name="what-scales-with-s"/>
       <w:bookmarkEnd w:id="189"/>
       <w:r>
@@ -25931,7 +25931,7 @@
         <w:spacing w:before="360" w:after="120"/>
         <w:rPr/>
       </w:pPr>
-      <w:bookmarkStart w:id="194" w:name="__RefHeading___Toc8009_1259212510"/>
+      <w:bookmarkStart w:id="194" w:name="__RefHeading___Toc7986_2866894291"/>
       <w:bookmarkStart w:id="195" w:name="latency"/>
       <w:bookmarkEnd w:id="194"/>
       <w:r>
@@ -25977,7 +25977,7 @@
         <w:spacing w:before="280" w:after="80"/>
         <w:rPr/>
       </w:pPr>
-      <w:bookmarkStart w:id="196" w:name="__RefHeading___Toc8011_1259212510"/>
+      <w:bookmarkStart w:id="196" w:name="__RefHeading___Toc7988_2866894291"/>
       <w:bookmarkEnd w:id="196"/>
       <w:r>
         <w:rPr>
@@ -26446,7 +26446,7 @@
       <w:r>
         <w:br w:type="page"/>
       </w:r>
-      <w:bookmarkStart w:id="199" w:name="__RefHeading___Toc8013_1259212510"/>
+      <w:bookmarkStart w:id="199" w:name="__RefHeading___Toc7990_2866894291"/>
       <w:bookmarkEnd w:id="199"/>
       <w:r>
         <w:rPr>
@@ -27217,7 +27217,7 @@
         <w:spacing w:before="280" w:after="80"/>
         <w:rPr/>
       </w:pPr>
-      <w:bookmarkStart w:id="201" w:name="__RefHeading___Toc8015_1259212510"/>
+      <w:bookmarkStart w:id="201" w:name="__RefHeading___Toc7992_2866894291"/>
       <w:bookmarkStart w:id="202" w:name="buffer-sizing"/>
       <w:bookmarkEnd w:id="201"/>
       <w:r>
@@ -27350,7 +27350,7 @@
         <w:spacing w:before="360" w:after="120"/>
         <w:rPr/>
       </w:pPr>
-      <w:bookmarkStart w:id="205" w:name="__RefHeading___Toc8017_1259212510"/>
+      <w:bookmarkStart w:id="205" w:name="__RefHeading___Toc7994_2866894291"/>
       <w:bookmarkStart w:id="206" w:name="resources"/>
       <w:bookmarkEnd w:id="205"/>
       <w:r>
@@ -27409,7 +27409,7 @@
         <w:spacing w:before="280" w:after="80"/>
         <w:rPr/>
       </w:pPr>
-      <w:bookmarkStart w:id="207" w:name="__RefHeading___Toc8019_1259212510"/>
+      <w:bookmarkStart w:id="207" w:name="__RefHeading___Toc7996_2866894291"/>
       <w:bookmarkEnd w:id="207"/>
       <w:r>
         <w:rPr>
@@ -28296,7 +28296,7 @@
       <w:r>
         <w:br w:type="page"/>
       </w:r>
-      <w:bookmarkStart w:id="210" w:name="__RefHeading___Toc8021_1259212510"/>
+      <w:bookmarkStart w:id="210" w:name="__RefHeading___Toc7998_2866894291"/>
       <w:bookmarkEnd w:id="210"/>
       <w:r>
         <w:rPr>
@@ -28783,7 +28783,7 @@
       <w:r>
         <w:br w:type="page"/>
       </w:r>
-      <w:bookmarkStart w:id="212" w:name="__RefHeading___Toc8023_1259212510"/>
+      <w:bookmarkStart w:id="212" w:name="__RefHeading___Toc8000_2866894291"/>
       <w:bookmarkEnd w:id="212"/>
       <w:r>
         <w:rPr>
@@ -28854,7 +28854,7 @@
         <w:spacing w:before="280" w:after="80"/>
         <w:rPr/>
       </w:pPr>
-      <w:bookmarkStart w:id="213" w:name="__RefHeading___Toc8025_1259212510"/>
+      <w:bookmarkStart w:id="213" w:name="__RefHeading___Toc8002_2866894291"/>
       <w:bookmarkStart w:id="214" w:name="scaling"/>
       <w:bookmarkEnd w:id="213"/>
       <w:r>
@@ -29017,7 +29017,7 @@
         <w:spacing w:before="360" w:after="120"/>
         <w:rPr/>
       </w:pPr>
-      <w:bookmarkStart w:id="217" w:name="__RefHeading___Toc8027_1259212510"/>
+      <w:bookmarkStart w:id="217" w:name="__RefHeading___Toc8004_2866894291"/>
       <w:bookmarkStart w:id="218" w:name="system-requirements"/>
       <w:bookmarkEnd w:id="217"/>
       <w:r>
@@ -29063,7 +29063,7 @@
         <w:spacing w:before="280" w:after="80"/>
         <w:rPr/>
       </w:pPr>
-      <w:bookmarkStart w:id="219" w:name="__RefHeading___Toc8029_1259212510"/>
+      <w:bookmarkStart w:id="219" w:name="__RefHeading___Toc8006_2866894291"/>
       <w:bookmarkStart w:id="220" w:name="the-consumer-provides"/>
       <w:bookmarkEnd w:id="219"/>
       <w:r>
@@ -29223,7 +29223,7 @@
         <w:spacing w:before="280" w:after="80"/>
         <w:rPr/>
       </w:pPr>
-      <w:bookmarkStart w:id="221" w:name="__RefHeading___Toc8031_1259212510"/>
+      <w:bookmarkStart w:id="221" w:name="__RefHeading___Toc8008_2866894291"/>
       <w:bookmarkStart w:id="222" w:name="the-consumer-gets"/>
       <w:bookmarkEnd w:id="221"/>
       <w:r>
@@ -29315,7 +29315,7 @@
         <w:spacing w:before="280" w:after="80"/>
         <w:rPr/>
       </w:pPr>
-      <w:bookmarkStart w:id="224" w:name="__RefHeading___Toc8033_1259212510"/>
+      <w:bookmarkStart w:id="224" w:name="__RefHeading___Toc8010_2866894291"/>
       <w:bookmarkStart w:id="225" w:name="environment"/>
       <w:bookmarkEnd w:id="224"/>
       <w:r>
@@ -29528,7 +29528,7 @@
         <w:spacing w:before="360" w:after="120"/>
         <w:rPr/>
       </w:pPr>
-      <w:bookmarkStart w:id="228" w:name="__RefHeading___Toc8035_1259212510"/>
+      <w:bookmarkStart w:id="228" w:name="__RefHeading___Toc8012_2866894291"/>
       <w:bookmarkStart w:id="229" w:name="parameter-configuration"/>
       <w:bookmarkEnd w:id="228"/>
       <w:r>
@@ -29588,7 +29588,7 @@
         <w:spacing w:before="280" w:after="80"/>
         <w:rPr/>
       </w:pPr>
-      <w:bookmarkStart w:id="230" w:name="__RefHeading___Toc8037_1259212510"/>
+      <w:bookmarkStart w:id="230" w:name="__RefHeading___Toc8014_2866894291"/>
       <w:bookmarkStart w:id="231" w:name="code"/>
       <w:bookmarkEnd w:id="230"/>
       <w:r>
@@ -30177,19 +30177,7 @@
                 <w:szCs w:val="24"/>
                 <w:lang w:val="en-US" w:eastAsia="en-US" w:bidi="ar-SA"/>
               </w:rPr>
-              <w:t xml:space="preserve">8 </w:t>
-            </w:r>
-            <w:r>
-              <w:rPr>
-                <w:rFonts w:eastAsia="Cambria" w:cs=""/>
-                <w:b/>
-                <w:bCs/>
-                <w:kern w:val="0"/>
-                <w:sz w:val="24"/>
-                <w:szCs w:val="24"/>
-                <w:lang w:val="en-US" w:eastAsia="en-US" w:bidi="ar-SA"/>
-              </w:rPr>
-              <w:t>TBD</w:t>
+              <w:t>8</w:t>
             </w:r>
           </w:p>
         </w:tc>
@@ -30251,7 +30239,7 @@
                 <w:szCs w:val="24"/>
                 <w:lang w:val="en-US" w:eastAsia="en-US" w:bidi="ar-SA"/>
               </w:rPr>
-              <w:t>D2</w:t>
+              <w:t>D2 decided</w:t>
             </w:r>
           </w:p>
         </w:tc>
@@ -30378,19 +30366,7 @@
                 <w:szCs w:val="24"/>
                 <w:lang w:val="en-US" w:eastAsia="en-US" w:bidi="ar-SA"/>
               </w:rPr>
-              <w:t xml:space="preserve">255 </w:t>
-            </w:r>
-            <w:r>
-              <w:rPr>
-                <w:rFonts w:eastAsia="Cambria" w:cs=""/>
-                <w:b/>
-                <w:bCs/>
-                <w:kern w:val="0"/>
-                <w:sz w:val="24"/>
-                <w:szCs w:val="24"/>
-                <w:lang w:val="en-US" w:eastAsia="en-US" w:bidi="ar-SA"/>
-              </w:rPr>
-              <w:t>TBD</w:t>
+              <w:t>2^m - 1</w:t>
             </w:r>
           </w:p>
         </w:tc>
@@ -30452,7 +30428,7 @@
                 <w:szCs w:val="24"/>
                 <w:lang w:val="en-US" w:eastAsia="en-US" w:bidi="ar-SA"/>
               </w:rPr>
-              <w:t>D3</w:t>
+              <w:t>D3 decided</w:t>
             </w:r>
           </w:p>
         </w:tc>
@@ -31467,7 +31443,58 @@
         <w:rPr>
           <w:sz w:val="20"/>
         </w:rPr>
-        <w:t>.</w:t>
+        <w:t>; elaboration fails if it is below 1.</w:t>
+      </w:r>
+    </w:p>
+    <w:p>
+      <w:pPr>
+        <w:pStyle w:val="BodyText"/>
+        <w:rPr/>
+      </w:pPr>
+      <w:r>
+        <w:rPr>
+          <w:sz w:val="20"/>
+        </w:rPr>
+        <w:t xml:space="preserve">Every code parameter is fixed at elaboration (Sean, 2026-09-30). There is no run-time t or n: the arrays are generate loops sized by t, the generator polynomial is computed by </w:t>
+      </w:r>
+      <w:r>
+        <w:rPr>
+          <w:rStyle w:val="VerbatimChar"/>
+          <w:sz w:val="20"/>
+        </w:rPr>
+        <w:t>gf_pkg</w:t>
+      </w:r>
+      <w:r>
+        <w:rPr>
+          <w:sz w:val="20"/>
+        </w:rPr>
+        <w:t xml:space="preserve"> when the design elaborates, and a block format change is a rebuild. A consumer that must mix formats in one instance would need a </w:t>
+      </w:r>
+      <w:r>
+        <w:rPr>
+          <w:rStyle w:val="VerbatimChar"/>
+          <w:sz w:val="20"/>
+        </w:rPr>
+        <w:t>T_MAX</w:t>
+      </w:r>
+      <w:r>
+        <w:rPr>
+          <w:sz w:val="20"/>
+        </w:rPr>
+        <w:t xml:space="preserve"> sizing parameter and a </w:t>
+      </w:r>
+      <w:r>
+        <w:rPr>
+          <w:rStyle w:val="VerbatimChar"/>
+          <w:sz w:val="20"/>
+        </w:rPr>
+        <w:t>cfg_t</w:t>
+      </w:r>
+      <w:r>
+        <w:rPr>
+          <w:sz w:val="20"/>
+        </w:rPr>
+        <w:t xml:space="preserve"> register, which is not in this specification.</w:t>
       </w:r>
       <w:bookmarkEnd w:id="231"/>
       <w:r>
@@ -31483,7 +31510,7 @@
         <w:spacing w:before="280" w:after="80"/>
         <w:rPr/>
       </w:pPr>
-      <w:bookmarkStart w:id="233" w:name="__RefHeading___Toc8039_1259212510"/>
+      <w:bookmarkStart w:id="233" w:name="__RefHeading___Toc8016_2866894291"/>
       <w:bookmarkStart w:id="234" w:name="interface"/>
       <w:bookmarkEnd w:id="233"/>
       <w:r>
@@ -33059,7 +33086,7 @@
         <w:spacing w:before="280" w:after="80"/>
         <w:rPr/>
       </w:pPr>
-      <w:bookmarkStart w:id="237" w:name="__RefHeading___Toc8041_1259212510"/>
+      <w:bookmarkStart w:id="237" w:name="__RefHeading___Toc8018_2866894291"/>
       <w:bookmarkStart w:id="238" w:name="open-decisions-in-one-place"/>
       <w:bookmarkEnd w:id="237"/>
       <w:r>
@@ -33222,198 +33249,6 @@
                 <w:lang w:val="en-US" w:eastAsia="en-US" w:bidi="ar-SA"/>
               </w:rPr>
               <w:t>Effect if left at the default</w:t>
-            </w:r>
-          </w:p>
-        </w:tc>
-      </w:tr>
-      <w:tr>
-        <w:trPr/>
-        <w:tc>
-          <w:tcPr>
-            <w:tcW w:w="3120" w:type="dxa"/>
-            <w:tcBorders/>
-          </w:tcPr>
-          <w:p>
-            <w:pPr>
-              <w:pStyle w:val="Compact"/>
-              <w:widowControl/>
-              <w:spacing w:before="36" w:after="36"/>
-              <w:jc w:val="left"/>
-              <w:rPr>
-                <w:rFonts w:ascii="Cambria" w:hAnsi="Cambria" w:eastAsia="Cambria" w:cs=""/>
-                <w:kern w:val="0"/>
-                <w:sz w:val="24"/>
-                <w:szCs w:val="24"/>
-                <w:lang w:val="en-US" w:eastAsia="en-US" w:bidi="ar-SA"/>
-              </w:rPr>
-            </w:pPr>
-            <w:r>
-              <w:rPr>
-                <w:rFonts w:eastAsia="Cambria" w:cs=""/>
-                <w:kern w:val="0"/>
-                <w:sz w:val="24"/>
-                <w:szCs w:val="24"/>
-                <w:lang w:val="en-US" w:eastAsia="en-US" w:bidi="ar-SA"/>
-              </w:rPr>
-              <w:t>D2 t</w:t>
-            </w:r>
-          </w:p>
-        </w:tc>
-        <w:tc>
-          <w:tcPr>
-            <w:tcW w:w="3120" w:type="dxa"/>
-            <w:tcBorders/>
-          </w:tcPr>
-          <w:p>
-            <w:pPr>
-              <w:pStyle w:val="Compact"/>
-              <w:widowControl/>
-              <w:spacing w:before="36" w:after="36"/>
-              <w:jc w:val="left"/>
-              <w:rPr>
-                <w:rFonts w:ascii="Cambria" w:hAnsi="Cambria" w:eastAsia="Cambria" w:cs=""/>
-                <w:kern w:val="0"/>
-                <w:sz w:val="24"/>
-                <w:szCs w:val="24"/>
-                <w:lang w:val="en-US" w:eastAsia="en-US" w:bidi="ar-SA"/>
-              </w:rPr>
-            </w:pPr>
-            <w:r>
-              <w:rPr>
-                <w:rFonts w:eastAsia="Cambria" w:cs=""/>
-                <w:kern w:val="0"/>
-                <w:sz w:val="24"/>
-                <w:szCs w:val="24"/>
-                <w:lang w:val="en-US" w:eastAsia="en-US" w:bidi="ar-SA"/>
-              </w:rPr>
-              <w:t>the consumer’s error model or the standard</w:t>
-            </w:r>
-          </w:p>
-        </w:tc>
-        <w:tc>
-          <w:tcPr>
-            <w:tcW w:w="3120" w:type="dxa"/>
-            <w:tcBorders/>
-          </w:tcPr>
-          <w:p>
-            <w:pPr>
-              <w:pStyle w:val="Compact"/>
-              <w:widowControl/>
-              <w:spacing w:before="36" w:after="36"/>
-              <w:jc w:val="left"/>
-              <w:rPr>
-                <w:rFonts w:ascii="Cambria" w:hAnsi="Cambria" w:eastAsia="Cambria" w:cs=""/>
-                <w:kern w:val="0"/>
-                <w:sz w:val="24"/>
-                <w:szCs w:val="24"/>
-                <w:lang w:val="en-US" w:eastAsia="en-US" w:bidi="ar-SA"/>
-              </w:rPr>
-            </w:pPr>
-            <w:r>
-              <w:rPr>
-                <w:rFonts w:eastAsia="Cambria" w:cs=""/>
-                <w:kern w:val="0"/>
-                <w:sz w:val="24"/>
-                <w:szCs w:val="24"/>
-                <w:lang w:val="en-US" w:eastAsia="en-US" w:bidi="ar-SA"/>
-              </w:rPr>
-              <w:t>RS(255,239)-class: 8 symbol errors per 255</w:t>
-            </w:r>
-          </w:p>
-        </w:tc>
-      </w:tr>
-      <w:tr>
-        <w:trPr/>
-        <w:tc>
-          <w:tcPr>
-            <w:tcW w:w="3120" w:type="dxa"/>
-            <w:tcBorders/>
-          </w:tcPr>
-          <w:p>
-            <w:pPr>
-              <w:pStyle w:val="Compact"/>
-              <w:widowControl/>
-              <w:spacing w:before="36" w:after="36"/>
-              <w:jc w:val="left"/>
-              <w:rPr>
-                <w:rFonts w:ascii="Cambria" w:hAnsi="Cambria" w:eastAsia="Cambria" w:cs=""/>
-                <w:kern w:val="0"/>
-                <w:sz w:val="24"/>
-                <w:szCs w:val="24"/>
-                <w:lang w:val="en-US" w:eastAsia="en-US" w:bidi="ar-SA"/>
-              </w:rPr>
-            </w:pPr>
-            <w:r>
-              <w:rPr>
-                <w:rFonts w:eastAsia="Cambria" w:cs=""/>
-                <w:kern w:val="0"/>
-                <w:sz w:val="24"/>
-                <w:szCs w:val="24"/>
-                <w:lang w:val="en-US" w:eastAsia="en-US" w:bidi="ar-SA"/>
-              </w:rPr>
-              <w:t>D3 shortening</w:t>
-            </w:r>
-          </w:p>
-        </w:tc>
-        <w:tc>
-          <w:tcPr>
-            <w:tcW w:w="3120" w:type="dxa"/>
-            <w:tcBorders/>
-          </w:tcPr>
-          <w:p>
-            <w:pPr>
-              <w:pStyle w:val="Compact"/>
-              <w:widowControl/>
-              <w:spacing w:before="36" w:after="36"/>
-              <w:jc w:val="left"/>
-              <w:rPr>
-                <w:rFonts w:ascii="Cambria" w:hAnsi="Cambria" w:eastAsia="Cambria" w:cs=""/>
-                <w:kern w:val="0"/>
-                <w:sz w:val="24"/>
-                <w:szCs w:val="24"/>
-                <w:lang w:val="en-US" w:eastAsia="en-US" w:bidi="ar-SA"/>
-              </w:rPr>
-            </w:pPr>
-            <w:r>
-              <w:rPr>
-                <w:rFonts w:eastAsia="Cambria" w:cs=""/>
-                <w:kern w:val="0"/>
-                <w:sz w:val="24"/>
-                <w:szCs w:val="24"/>
-                <w:lang w:val="en-US" w:eastAsia="en-US" w:bidi="ar-SA"/>
-              </w:rPr>
-              <w:t>the consumer’s block size</w:t>
-            </w:r>
-          </w:p>
-        </w:tc>
-        <w:tc>
-          <w:tcPr>
-            <w:tcW w:w="3120" w:type="dxa"/>
-            <w:tcBorders/>
-          </w:tcPr>
-          <w:p>
-            <w:pPr>
-              <w:pStyle w:val="Compact"/>
-              <w:widowControl/>
-              <w:spacing w:before="36" w:after="36"/>
-              <w:jc w:val="left"/>
-              <w:rPr>
-                <w:rFonts w:ascii="Cambria" w:hAnsi="Cambria" w:eastAsia="Cambria" w:cs=""/>
-                <w:kern w:val="0"/>
-                <w:sz w:val="24"/>
-                <w:szCs w:val="24"/>
-                <w:lang w:val="en-US" w:eastAsia="en-US" w:bidi="ar-SA"/>
-              </w:rPr>
-            </w:pPr>
-            <w:r>
-              <w:rPr>
-                <w:rFonts w:eastAsia="Cambria" w:cs=""/>
-                <w:kern w:val="0"/>
-                <w:sz w:val="24"/>
-                <w:szCs w:val="24"/>
-                <w:lang w:val="en-US" w:eastAsia="en-US" w:bidi="ar-SA"/>
-              </w:rPr>
-              <w:t>full-length blocks</w:t>
             </w:r>
           </w:p>
         </w:tc>
@@ -33902,7 +33737,7 @@
         <w:spacing w:before="360" w:after="120"/>
         <w:rPr/>
       </w:pPr>
-      <w:bookmarkStart w:id="242" w:name="__RefHeading___Toc8043_1259212510"/>
+      <w:bookmarkStart w:id="242" w:name="__RefHeading___Toc8020_2866894291"/>
       <w:bookmarkStart w:id="243" w:name="candidate-profiles"/>
       <w:bookmarkEnd w:id="242"/>
       <w:r>
@@ -36006,7 +35841,7 @@
         <w:spacing w:before="360" w:after="120"/>
         <w:rPr/>
       </w:pPr>
-      <w:bookmarkStart w:id="246" w:name="__RefHeading___Toc8045_1259212510"/>
+      <w:bookmarkStart w:id="246" w:name="__RefHeading___Toc8022_2866894291"/>
       <w:bookmarkStart w:id="247" w:name="verification-strategy"/>
       <w:bookmarkEnd w:id="246"/>
       <w:r>
@@ -36038,7 +35873,7 @@
         <w:spacing w:before="280" w:after="80"/>
         <w:rPr/>
       </w:pPr>
-      <w:bookmarkStart w:id="248" w:name="__RefHeading___Toc8047_1259212510"/>
+      <w:bookmarkStart w:id="248" w:name="__RefHeading___Toc8024_2866894291"/>
       <w:bookmarkStart w:id="249" w:name="golden-model"/>
       <w:bookmarkEnd w:id="248"/>
       <w:r>
@@ -36111,7 +35946,7 @@
         <w:spacing w:before="280" w:after="80"/>
         <w:rPr/>
       </w:pPr>
-      <w:bookmarkStart w:id="250" w:name="__RefHeading___Toc8049_1259212510"/>
+      <w:bookmarkStart w:id="250" w:name="__RefHeading___Toc8026_2866894291"/>
       <w:bookmarkEnd w:id="250"/>
       <w:r>
         <w:rPr>
@@ -37166,7 +37001,7 @@
       <w:r>
         <w:br w:type="page"/>
       </w:r>
-      <w:bookmarkStart w:id="253" w:name="__RefHeading___Toc8051_1259212510"/>
+      <w:bookmarkStart w:id="253" w:name="__RefHeading___Toc8028_2866894291"/>
       <w:bookmarkEnd w:id="253"/>
       <w:r>
         <w:rPr>
@@ -37263,7 +37098,7 @@
         <w:spacing w:before="280" w:after="80"/>
         <w:rPr/>
       </w:pPr>
-      <w:bookmarkStart w:id="254" w:name="__RefHeading___Toc8053_1259212510"/>
+      <w:bookmarkStart w:id="254" w:name="__RefHeading___Toc8030_2866894291"/>
       <w:bookmarkStart w:id="255" w:name="formal"/>
       <w:bookmarkEnd w:id="254"/>
       <w:r>
@@ -37323,7 +37158,7 @@
         <w:spacing w:before="280" w:after="80"/>
         <w:rPr/>
       </w:pPr>
-      <w:bookmarkStart w:id="256" w:name="__RefHeading___Toc8055_1259212510"/>
+      <w:bookmarkStart w:id="256" w:name="__RefHeading___Toc8032_2866894291"/>
       <w:bookmarkStart w:id="257" w:name="coverage"/>
       <w:bookmarkEnd w:id="256"/>
       <w:r>
@@ -37456,7 +37291,7 @@
         <w:spacing w:before="360" w:after="120"/>
         <w:rPr/>
       </w:pPr>
-      <w:bookmarkStart w:id="260" w:name="__RefHeading___Toc8057_1259212510"/>
+      <w:bookmarkStart w:id="260" w:name="__RefHeading___Toc8034_2866894291"/>
       <w:bookmarkStart w:id="261" w:name="synthesis-and-implementation"/>
       <w:bookmarkEnd w:id="260"/>
       <w:r>
@@ -37488,7 +37323,7 @@
         <w:spacing w:before="280" w:after="80"/>
         <w:rPr/>
       </w:pPr>
-      <w:bookmarkStart w:id="262" w:name="__RefHeading___Toc8059_1259212510"/>
+      <w:bookmarkStart w:id="262" w:name="__RefHeading___Toc8036_2866894291"/>
       <w:bookmarkStart w:id="263" w:name="characterisation-plan"/>
       <w:bookmarkEnd w:id="262"/>
       <w:r>
@@ -38265,7 +38100,7 @@
         <w:spacing w:before="280" w:after="80"/>
         <w:rPr/>
       </w:pPr>
-      <w:bookmarkStart w:id="265" w:name="__RefHeading___Toc8061_1259212510"/>
+      <w:bookmarkStart w:id="265" w:name="__RefHeading___Toc8038_2866894291"/>
       <w:bookmarkStart w:id="266" w:name="implementation-notes"/>
       <w:bookmarkEnd w:id="265"/>
       <w:r>

</xml_diff>